<commit_message>
document verified production role audit
</commit_message>
<xml_diff>
--- a/docs/FundInv_Final_Presentation_Operating_Guide.docx
+++ b/docs/FundInv_Final_Presentation_Operating_Guide.docx
@@ -438,7 +438,7 @@
                 <w:color w:val="0D1B35"/>
                 <w:sz w:val="18"/>
               </w:rPr>
-              <w:t>Admin access, Investor fund browsing, demo PayNow subscription, Operations settlement, Manager manual valuation with preview, Investor P&amp;L allocation, redemption, holdings, analytics, audit records, and AWS-hosted access were exercised successfully.</w:t>
+              <w:t>Admin access, Investor fund browsing, demo PayNow subscription, Operations settlement, Alpaca-assisted Manager valuation with preview, Investor P&amp;L allocation, redemption, holdings, analytics, audit records, and AWS-hosted access were exercised successfully.</w:t>
             </w:r>
           </w:p>
         </w:tc>
@@ -627,7 +627,7 @@
                 <w:color w:val="0D1B35"/>
                 <w:sz w:val="16"/>
               </w:rPr>
-              <w:t>34/34 unit and integration tests</w:t>
+              <w:t>36/36 unit and integration tests</w:t>
             </w:r>
           </w:p>
         </w:tc>
@@ -743,7 +743,7 @@
                 <w:color w:val="0D1B35"/>
                 <w:sz w:val="16"/>
               </w:rPr>
-              <w:t>Live subscription</w:t>
+              <w:t>Four-role browser audit</w:t>
             </w:r>
           </w:p>
         </w:tc>
@@ -799,7 +799,7 @@
                 <w:color w:val="0D1B35"/>
                 <w:sz w:val="16"/>
               </w:rPr>
-              <w:t>$12.34 matched, settled once</w:t>
+              <w:t>10/10 deployed route, access, and cross-role checks</w:t>
             </w:r>
           </w:p>
         </w:tc>
@@ -829,7 +829,7 @@
                 <w:color w:val="0D1B35"/>
                 <w:sz w:val="16"/>
               </w:rPr>
-              <w:t>Live redemption</w:t>
+              <w:t>Live subscription</w:t>
             </w:r>
           </w:p>
         </w:tc>
@@ -885,7 +885,7 @@
                 <w:color w:val="0D1B35"/>
                 <w:sz w:val="16"/>
               </w:rPr>
-              <w:t>$7.89 approved, transferred, completed</w:t>
+              <w:t>$12.34 matched, settled once</w:t>
             </w:r>
           </w:p>
         </w:tc>
@@ -915,7 +915,7 @@
                 <w:color w:val="0D1B35"/>
                 <w:sz w:val="16"/>
               </w:rPr>
-              <w:t>P&amp;L allocation</w:t>
+              <w:t>Live redemption</w:t>
             </w:r>
           </w:p>
         </w:tc>
@@ -971,7 +971,7 @@
                 <w:color w:val="0D1B35"/>
                 <w:sz w:val="16"/>
               </w:rPr>
-              <w:t>$10 fund P&amp;L allocated $4.00 to a 40% holder</w:t>
+              <w:t>$7.89 approved, transferred, completed</w:t>
             </w:r>
           </w:p>
         </w:tc>
@@ -1001,7 +1001,7 @@
                 <w:color w:val="0D1B35"/>
                 <w:sz w:val="16"/>
               </w:rPr>
-              <w:t>Investor dashboard consistency</w:t>
+              <w:t>P&amp;L allocation</w:t>
             </w:r>
           </w:p>
         </w:tc>
@@ -1057,7 +1057,7 @@
                 <w:color w:val="0D1B35"/>
                 <w:sz w:val="16"/>
               </w:rPr>
-              <w:t>Value changed by net cash flow of +$4.45</w:t>
+              <w:t>$10 fund P&amp;L allocated $4.00 to a 40% holder</w:t>
             </w:r>
           </w:p>
         </w:tc>
@@ -1087,7 +1087,7 @@
                 <w:color w:val="0D1B35"/>
                 <w:sz w:val="16"/>
               </w:rPr>
-              <w:t>Automatic market suggestion</w:t>
+              <w:t>Investor dashboard consistency</w:t>
             </w:r>
           </w:p>
         </w:tc>
@@ -1115,7 +1115,7 @@
                 <w:color w:val="0D1B35"/>
                 <w:sz w:val="16"/>
               </w:rPr>
-              <w:t>BLOCKED</w:t>
+              <w:t>PASS</w:t>
             </w:r>
           </w:p>
         </w:tc>
@@ -1143,7 +1143,7 @@
                 <w:color w:val="0D1B35"/>
                 <w:sz w:val="16"/>
               </w:rPr>
-              <w:t>AWS runtime receives Alpaca 401 Unauthorized</w:t>
+              <w:t>Value changed by net cash flow of +$4.45</w:t>
             </w:r>
           </w:p>
         </w:tc>
@@ -1173,6 +1173,92 @@
                 <w:color w:val="0D1B35"/>
                 <w:sz w:val="16"/>
               </w:rPr>
+              <w:t>Automatic market suggestion</w:t>
+            </w:r>
+          </w:p>
+        </w:tc>
+        <w:tc>
+          <w:tcPr>
+            <w:tcW w:type="dxa" w:w="1152"/>
+            <w:vAlign w:val="center"/>
+            <w:tcMar>
+              <w:top w:w="90" w:type="dxa"/>
+              <w:start w:w="100" w:type="dxa"/>
+              <w:bottom w:w="90" w:type="dxa"/>
+              <w:end w:w="100" w:type="dxa"/>
+            </w:tcMar>
+            <w:shd w:fill="F1F5F9"/>
+          </w:tcPr>
+          <w:p>
+            <w:pPr>
+              <w:spacing w:after="0"/>
+            </w:pPr>
+            <w:r/>
+            <w:r>
+              <w:rPr>
+                <w:rFonts w:ascii="Aptos" w:hAnsi="Aptos"/>
+                <w:b w:val="0"/>
+                <w:color w:val="0D1B35"/>
+                <w:sz w:val="16"/>
+              </w:rPr>
+              <w:t>PASS</w:t>
+            </w:r>
+          </w:p>
+        </w:tc>
+        <w:tc>
+          <w:tcPr>
+            <w:tcW w:type="dxa" w:w="6192"/>
+            <w:vAlign w:val="center"/>
+            <w:tcMar>
+              <w:top w:w="90" w:type="dxa"/>
+              <w:start w:w="100" w:type="dxa"/>
+              <w:bottom w:w="90" w:type="dxa"/>
+              <w:end w:w="100" w:type="dxa"/>
+            </w:tcMar>
+            <w:shd w:fill="F1F5F9"/>
+          </w:tcPr>
+          <w:p>
+            <w:pPr>
+              <w:spacing w:after="0"/>
+            </w:pPr>
+            <w:r/>
+            <w:r>
+              <w:rPr>
+                <w:rFonts w:ascii="Aptos" w:hAnsi="Aptos"/>
+                <w:b w:val="0"/>
+                <w:color w:val="0D1B35"/>
+                <w:sz w:val="16"/>
+              </w:rPr>
+              <w:t>AWS Alpaca account/data calls return 200; VOO prefill verified</w:t>
+            </w:r>
+          </w:p>
+        </w:tc>
+      </w:tr>
+      <w:tr>
+        <w:tc>
+          <w:tcPr>
+            <w:tcW w:type="dxa" w:w="2232"/>
+            <w:vAlign w:val="center"/>
+            <w:tcMar>
+              <w:top w:w="90" w:type="dxa"/>
+              <w:start w:w="100" w:type="dxa"/>
+              <w:bottom w:w="90" w:type="dxa"/>
+              <w:end w:w="100" w:type="dxa"/>
+            </w:tcMar>
+            <w:shd w:fill="FFFFFF"/>
+          </w:tcPr>
+          <w:p>
+            <w:pPr>
+              <w:spacing w:after="0"/>
+            </w:pPr>
+            <w:r/>
+            <w:r>
+              <w:rPr>
+                <w:rFonts w:ascii="Aptos" w:hAnsi="Aptos"/>
+                <w:b w:val="0"/>
+                <w:color w:val="0D1B35"/>
+                <w:sz w:val="16"/>
+              </w:rPr>
               <w:t>CI/CD credentials</w:t>
             </w:r>
           </w:p>
@@ -1187,7 +1273,7 @@
               <w:bottom w:w="90" w:type="dxa"/>
               <w:end w:w="100" w:type="dxa"/>
             </w:tcMar>
-            <w:shd w:fill="F1F5F9"/>
+            <w:shd w:fill="FFFFFF"/>
           </w:tcPr>
           <w:p>
             <w:pPr>
@@ -1215,7 +1301,7 @@
               <w:bottom w:w="90" w:type="dxa"/>
               <w:end w:w="100" w:type="dxa"/>
             </w:tcMar>
-            <w:shd w:fill="F1F5F9"/>
+            <w:shd w:fill="FFFFFF"/>
           </w:tcPr>
           <w:p>
             <w:pPr>
@@ -1293,7 +1379,7 @@
                 <w:color w:val="0D1B35"/>
                 <w:sz w:val="18"/>
               </w:rPr>
-              <w:t>The controlled manual valuation path works, but automatic Alpaca-derived P&amp;L is not currently available in AWS. Present it as an external-credential limitation, not as a working feature.</w:t>
+              <w:t>The demonstrated workflows and controls have passed the current test suite, but no finite test proves zero defects or enterprise readiness. Present the system as a tested capstone deployment with documented operational limits.</w:t>
             </w:r>
           </w:p>
         </w:tc>
@@ -2790,14 +2876,14 @@
         <w:tc>
           <w:tcPr>
             <w:tcW w:type="dxa" w:w="129"/>
-            <w:shd w:fill="B45309"/>
+            <w:shd w:fill="15803D"/>
           </w:tcPr>
           <w:p/>
         </w:tc>
         <w:tc>
           <w:tcPr>
             <w:tcW w:type="dxa" w:w="9648"/>
-            <w:shd w:fill="FFFBEB"/>
+            <w:shd w:fill="F0FDF4"/>
             <w:tcMar>
               <w:top w:w="125" w:type="dxa"/>
               <w:start w:w="150" w:type="dxa"/>
@@ -2813,7 +2899,7 @@
               <w:rPr>
                 <w:rFonts w:ascii="Aptos" w:hAnsi="Aptos"/>
                 <w:b/>
-                <w:color w:val="B45309"/>
+                <w:color w:val="15803D"/>
                 <w:sz w:val="19"/>
               </w:rPr>
               <w:t>Current production condition</w:t>
@@ -2829,7 +2915,7 @@
                 <w:color w:val="0D1B35"/>
                 <w:sz w:val="18"/>
               </w:rPr>
-              <w:t>The deployed backend is sending an authenticated Alpaca request with the IEX feed, but Alpaca responds 401 Unauthorized. Therefore the automatic suggestion is unavailable today. A manager_entry value has no internal market-data proof; it must come from a broker/custodian statement or another authorised accounting source and must be explained in the audit note.</w:t>
+              <w:t>AWS now authenticates successfully to Alpaca paper trading and IEX market data. The deployed VOO check for 3 August 2026 returned a +1.45681278% market return and automatically suggested +$74.3703 on $5,105.00 opening assets. The Manager still reviews the prices, date, weights and preview before finalizing.</w:t>
             </w:r>
           </w:p>
         </w:tc>
@@ -2890,7 +2976,7 @@
         <w:t xml:space="preserve">3.  </w:t>
       </w:r>
       <w:r>
-        <w:t>If the service is unavailable, enter only a prepared externally verified P&amp;L and write the source/reason in Audit note.</w:t>
+        <w:t>Use the prefilled suggestion when the source, date and component figures are correct. Override it only for an approved accounting adjustment and explain that adjustment in Audit note.</w:t>
       </w:r>
     </w:p>
     <w:p>
@@ -7844,7 +7930,7 @@
                 <w:color w:val="0D1B35"/>
                 <w:sz w:val="14"/>
               </w:rPr>
-              <w:t>Shows only Manager-owned products, not the full catalogue</w:t>
+              <w:t>Shows all 13 assigned demo products plus future Manager-created products</w:t>
             </w:r>
           </w:p>
         </w:tc>
@@ -8618,7 +8704,7 @@
                 <w:color w:val="0D1B35"/>
                 <w:sz w:val="14"/>
               </w:rPr>
-              <w:t>Requests automatic market-data suggestion</w:t>
+              <w:t>Requests and prefills the Alpaca market-data suggestion</w:t>
             </w:r>
           </w:p>
         </w:tc>
@@ -8646,7 +8732,7 @@
                 <w:color w:val="0D1B35"/>
                 <w:sz w:val="14"/>
               </w:rPr>
-              <w:t>Currently blocked in AWS by Alpaca 401</w:t>
+              <w:t>Manager reviews it before preview/finalization</w:t>
             </w:r>
           </w:p>
         </w:tc>
@@ -12725,7 +12811,7 @@
                 <w:color w:val="0D1B35"/>
                 <w:sz w:val="18"/>
               </w:rPr>
-              <w:t>The role handoffs and core accounting controls are coherent and usable. The demo is smooth when role windows and a finalized NAV are prepared. It is not fully seamless because external market-data authentication and CI/CD credentials still need repair.</w:t>
+              <w:t>The role handoffs and core accounting controls are coherent and usable. The demo is smooth when role windows and an unfinalized valuation date are prepared. Alpaca market-data authentication now works; CI/CD credentials and single-instance availability remain operational limitations.</w:t>
             </w:r>
           </w:p>
         </w:tc>
@@ -12858,7 +12944,7 @@
                 <w:color w:val="0D1B35"/>
                 <w:sz w:val="15"/>
               </w:rPr>
-              <w:t>Alpaca returns 401 in AWS</w:t>
+              <w:t>External market-data outage</w:t>
             </w:r>
           </w:p>
         </w:tc>
@@ -12886,7 +12972,7 @@
                 <w:color w:val="0D1B35"/>
                 <w:sz w:val="15"/>
               </w:rPr>
-              <w:t>Refresh calculation cannot prefill suggested P&amp;L</w:t>
+              <w:t>Automatic suggestion may be temporarily unavailable</w:t>
             </w:r>
           </w:p>
         </w:tc>
@@ -12914,7 +13000,7 @@
                 <w:color w:val="0D1B35"/>
                 <w:sz w:val="15"/>
               </w:rPr>
-              <w:t>Use prepared audited manual P&amp;L; repair AWS credential later</w:t>
+              <w:t>Use a prepared authoritative figure with an audit note; do not invent or Google dollar P&amp;L</w:t>
             </w:r>
           </w:p>
         </w:tc>

</xml_diff>